<commit_message>
Clarify AI use in the national games declaration and review
Co-Authored-By: Claude Opus 5.5 <noreply@anthropic.com>
Claude-Session: https://claude.ai/code/session_01GWp2V469ega9rMmDw4DHEN
</commit_message>
<xml_diff>
--- a/Zerde_Ulttyq_oiyndar/ZhI_deklaratsiyasy.docx
+++ b/Zerde_Ulttyq_oiyndar/ZhI_deklaratsiyasy.docx
@@ -452,7 +452,7 @@
                 <w:sz w:val="22"/>
                 <w:szCs w:val="22"/>
               </w:rPr>
-              <w:t xml:space="preserve">1–3-кезеңдер және 5-кезең: жұмыстың құрылымын жоспарлау, ойындарды топтастыру мен кодтау жүйесінің үлгісін жасау, зерттеу кестесін, сауалнама мен келісім парағының үлгісін дайындау, мәтінді тілдік редакциялау, өзім жинаған деректер бойынша кесте мен диаграмма жасау, Google Forms-тан жүктелген есімсіз сауалнама жауаптарын зерттеу кестесіне аудару</w:t>
+              <w:t xml:space="preserve">1–3-кезеңдер және 5-кезең: жұмыстың құрылымын жоспарлау, ойындарды топтастыру мен кодтау жүйесінің үлгісін жасау, зерттеу кестесін, сауалнама мен келісім парағының үлгісін дайындау, өзім жинаған деректер мен жазбаларым бойынша мәтіннің жобасын жазу және тілдік редакциялау, кесте мен диаграмма жасау, Google Forms-тан жүктелген есімсіз сауалнама жауаптарын зерттеу кестесіне аудару</w:t>
             </w:r>
           </w:p>
         </w:tc>
@@ -666,7 +666,7 @@
                 <w:sz w:val="22"/>
                 <w:szCs w:val="22"/>
               </w:rPr>
-              <w:t xml:space="preserve">Жұмыстың құрылымы; 1–8-кестелер мен 1–6-суреттердің ресімделуі; Ә, Б қосымшаларының үлгісі; мәтіннің редакциясы (барлық бөлім)</w:t>
+              <w:t xml:space="preserve">Жұмыстың құрылымы; 1–8-кестелер мен 1–6-суреттердің ресімделуі; Ә, Б қосымшаларының үлгісі; менің деректерім бойынша жазылған мәтіннің жобасы мен редакциясы (барлық бөлім)</w:t>
             </w:r>
           </w:p>
         </w:tc>
@@ -880,7 +880,7 @@
                 <w:sz w:val="22"/>
                 <w:szCs w:val="22"/>
               </w:rPr>
-              <w:t xml:space="preserve">Шығармаларды өзім оқып, эпизодтарды өзім тауып, кодтадым; сауалнаманы жетекшіммен бірге жасап, өзім жүргіздім; ЖИ шығарма мәтіндерін талдауға пайдаланылмады. </w:t>
+              <w:t xml:space="preserve">Шығармаларды өзім оқып, эпизодтарды өзім тауып, кодтадым; сауалнаманы жетекшіммен бірге жасап, өзім жүргіздім; ЖИ шығарма мәтіндерін талдауға пайдаланылмады. Шығармалар мен басылымдарды өзім таңдадым; «Күнікей қыздағы» жаяу бәйгені тізімде жоқ ойын ретінде өзім қостым; мәтіндегі сандарды зерттеу кестесімен салыстырып тексердім. </w:t>
             </w:r>
             <w:r>
               <w:rPr>
@@ -891,7 +891,7 @@
                 <w:szCs w:val="22"/>
                 <w:highlight w:val="yellow"/>
               </w:rPr>
-              <w:t xml:space="preserve">[ЖИ ұсынған мәтінге өз бетіңізше не өзгерткеніңізді, нені қосқаныңызды нақты жазыңыз]</w:t>
+              <w:t xml:space="preserve">[Мәтінге өзіңіз енгізген түзетулерді қосыңыз]</w:t>
             </w:r>
           </w:p>
         </w:tc>

</xml_diff>